<commit_message>
Fill in author information on the title page and cover letter
Co-Authored-By: Claude Sonnet 5.5 <noreply@anthropic.com>
Claude-Session: https://claude.ai/code/session_01VRbK37d38KZhVAbWS4xw4x
</commit_message>
<xml_diff>
--- a/llm-count-study/ISR_cover_letter.docx
+++ b/llm-count-study/ISR_cover_letter.docx
@@ -11,7 +11,7 @@
           <w:b w:val="0"/>
           <w:i w:val="0"/>
         </w:rPr>
-        <w:t>[Date]</w:t>
+        <w:t>October 17, 2026</w:t>
       </w:r>
     </w:p>
     <w:p>
@@ -137,11 +137,11 @@
         </w:rPr>
         <w:t>Sincerely,</w:t>
         <w:br/>
-        <w:t>[Corresponding author name]</w:t>
+        <w:t>Ook Lee</w:t>
         <w:br/>
-        <w:t>[Affiliation]</w:t>
+        <w:t>Department of Information Systems, Hanyang University, Seoul, Korea</w:t>
         <w:br/>
-        <w:t>[Email]</w:t>
+        <w:t>ooklee@hanyang.ac.kr</w:t>
       </w:r>
     </w:p>
     <w:sectPr>

</xml_diff>